<commit_message>
docs: charte unifiée entre les deux procédures, un seul générateur
Les deux documents sortent désormais du même script, ce qui garantit une
mise en forme identique : Arial pour les titres, Cambria pour le corps,
même accent, mêmes espacements, mêmes tableaux.

- bandeau réduit à « PROCÉDURE INTERNE », sans référence
- pied de page : « Document interne » suivi de la pagination
- police posée explicitement sur chaque bloc : un enregistrement dans
  Word ne peut plus rebasculer le corps de texte en Calibri
- espacements resserrés pour que PRO-ACH-001 tienne sur une page

Pagination vérifiée au rendu : 1 page et 2 pages.

Co-Authored-By: Claude Opus 5 <noreply@anthropic.com>
Claude-Session: https://claude.ai/code/session_015f3bXvDt4ZWz22riASrzWJ
</commit_message>
<xml_diff>
--- a/procedure-lyreco/PRO-SG-002_Cloisons_mobiles.docx
+++ b/procedure-lyreco/PRO-SG-002_Cloisons_mobiles.docx
@@ -16,7 +16,7 @@
           <w:sz w:val="15"/>
           <w:szCs w:val="15"/>
         </w:rPr>
-        <w:t xml:space="preserve">PROCÉDURE INTERNE · PRO-SG-002</w:t>
+        <w:t xml:space="preserve">PROCÉDURE INTERNE</w:t>
       </w:r>
     </w:p>
     <w:p>
@@ -30,15 +30,15 @@
           <w:b/>
           <w:bCs/>
           <w:color w:val="17232A"/>
-          <w:sz w:val="40"/>
-          <w:szCs w:val="40"/>
+          <w:sz w:val="36"/>
+          <w:szCs w:val="36"/>
         </w:rPr>
         <w:t xml:space="preserve">Déverrouillage et manutention des cloisons mobiles</w:t>
       </w:r>
     </w:p>
     <w:p>
       <w:pPr>
-        <w:spacing w:after="110" w:line="250"/>
+        <w:spacing w:after="90" w:line="240"/>
       </w:pPr>
       <w:r>
         <w:rPr>
@@ -46,8 +46,8 @@
           <w:i/>
           <w:iCs/>
           <w:color w:val="5B6C72"/>
-          <w:sz w:val="21"/>
-          <w:szCs w:val="21"/>
+          <w:sz w:val="19"/>
+          <w:szCs w:val="19"/>
         </w:rPr>
         <w:t xml:space="preserve">Mode opératoire pour replier, déplacer et remiser les murs de cloisons mobiles d'une salle de réunion, dans l'ordre imposé par le plan d'implantation.</w:t>
       </w:r>
@@ -130,7 +130,7 @@
         <w:pBdr>
           <w:top w:val="single" w:color="D3DBDB" w:sz="4" w:space="8"/>
         </w:pBdr>
-        <w:spacing w:after="75" w:before="180"/>
+        <w:spacing w:after="62" w:before="140"/>
       </w:pPr>
       <w:r>
         <w:rPr>
@@ -157,7 +157,7 @@
     </w:p>
     <w:p>
       <w:pPr>
-        <w:spacing w:after="75" w:line="245"/>
+        <w:spacing w:after="58" w:line="240"/>
       </w:pPr>
       <w:r>
         <w:rPr>
@@ -249,7 +249,7 @@
     </w:p>
     <w:p>
       <w:pPr>
-        <w:spacing w:after="75" w:line="245"/>
+        <w:spacing w:after="58" w:line="240"/>
       </w:pPr>
       <w:r>
         <w:rPr>
@@ -328,7 +328,7 @@
     </w:p>
     <w:p>
       <w:pPr>
-        <w:spacing w:after="75" w:line="245"/>
+        <w:spacing w:after="58" w:line="240"/>
       </w:pPr>
       <w:r>
         <w:rPr>
@@ -346,7 +346,7 @@
         <w:pBdr>
           <w:top w:val="single" w:color="D3DBDB" w:sz="4" w:space="8"/>
         </w:pBdr>
-        <w:spacing w:after="75" w:before="180"/>
+        <w:spacing w:after="62" w:before="140"/>
       </w:pPr>
       <w:r>
         <w:rPr>
@@ -408,7 +408,7 @@
     </w:p>
     <w:p>
       <w:pPr>
-        <w:spacing w:after="75" w:line="245"/>
+        <w:spacing w:after="58" w:line="240"/>
       </w:pPr>
       <w:r>
         <w:rPr>
@@ -427,7 +427,7 @@
           <w:ilvl w:val="0"/>
           <w:numId w:val="2"/>
         </w:numPr>
-        <w:spacing w:after="45" w:line="250"/>
+        <w:spacing w:after="38" w:line="240"/>
       </w:pPr>
       <w:r>
         <w:rPr>
@@ -446,7 +446,7 @@
           <w:ilvl w:val="0"/>
           <w:numId w:val="2"/>
         </w:numPr>
-        <w:spacing w:after="45" w:line="250"/>
+        <w:spacing w:after="38" w:line="240"/>
       </w:pPr>
       <w:r>
         <w:rPr>
@@ -465,7 +465,7 @@
           <w:ilvl w:val="0"/>
           <w:numId w:val="2"/>
         </w:numPr>
-        <w:spacing w:after="45" w:line="250"/>
+        <w:spacing w:after="38" w:line="240"/>
       </w:pPr>
       <w:r>
         <w:rPr>
@@ -514,7 +514,7 @@
     </w:p>
     <w:p>
       <w:pPr>
-        <w:spacing w:after="75" w:line="245"/>
+        <w:spacing w:after="58" w:line="240"/>
       </w:pPr>
       <w:r>
         <w:rPr>
@@ -533,7 +533,7 @@
           <w:ilvl w:val="0"/>
           <w:numId w:val="2"/>
         </w:numPr>
-        <w:spacing w:after="45" w:line="250"/>
+        <w:spacing w:after="38" w:line="240"/>
       </w:pPr>
       <w:r>
         <w:rPr>
@@ -552,7 +552,7 @@
           <w:ilvl w:val="0"/>
           <w:numId w:val="2"/>
         </w:numPr>
-        <w:spacing w:after="45" w:line="250"/>
+        <w:spacing w:after="38" w:line="240"/>
       </w:pPr>
       <w:r>
         <w:rPr>
@@ -571,7 +571,7 @@
           <w:ilvl w:val="0"/>
           <w:numId w:val="2"/>
         </w:numPr>
-        <w:spacing w:after="45" w:line="250"/>
+        <w:spacing w:after="38" w:line="240"/>
       </w:pPr>
       <w:r>
         <w:rPr>
@@ -625,7 +625,7 @@
           <w:ilvl w:val="0"/>
           <w:numId w:val="2"/>
         </w:numPr>
-        <w:spacing w:after="45" w:line="250"/>
+        <w:spacing w:after="38" w:line="240"/>
       </w:pPr>
       <w:r>
         <w:rPr>
@@ -644,7 +644,7 @@
           <w:ilvl w:val="0"/>
           <w:numId w:val="2"/>
         </w:numPr>
-        <w:spacing w:after="45" w:line="250"/>
+        <w:spacing w:after="38" w:line="240"/>
       </w:pPr>
       <w:r>
         <w:rPr>
@@ -663,7 +663,7 @@
           <w:ilvl w:val="0"/>
           <w:numId w:val="2"/>
         </w:numPr>
-        <w:spacing w:after="45" w:line="250"/>
+        <w:spacing w:after="38" w:line="240"/>
       </w:pPr>
       <w:r>
         <w:rPr>
@@ -682,7 +682,7 @@
           <w:ilvl w:val="0"/>
           <w:numId w:val="2"/>
         </w:numPr>
-        <w:spacing w:after="45" w:line="250"/>
+        <w:spacing w:after="38" w:line="240"/>
       </w:pPr>
       <w:r>
         <w:rPr>
@@ -783,7 +783,7 @@
     <w:sectPr>
       <w:footerReference w:type="default" r:id="rId7"/>
       <w:pgSz w:w="11906" w:h="16838" w:orient="portrait"/>
-      <w:pgMar w:top="964" w:right="1021" w:bottom="850" w:left="1021" w:header="708" w:footer="708" w:gutter="0"/>
+      <w:pgMar w:top="880" w:right="1021" w:bottom="780" w:left="1021" w:header="708" w:footer="708" w:gutter="0"/>
       <w:pgNumType/>
       <w:docGrid w:linePitch="360"/>
     </w:sectPr>
@@ -848,7 +848,7 @@
         <w:sz w:val="13"/>
         <w:szCs w:val="13"/>
       </w:rPr>
-      <w:t xml:space="preserve">PRO-SG-002 · Version 1.0  ·  Propriété exclusive des Services Généraux Audika          </w:t>
+      <w:t xml:space="preserve">Document interne          </w:t>
     </w:r>
     <w:r>
       <w:rPr>
@@ -1020,18 +1020,6 @@
     </w:lvl>
   </w:abstractNum>
   <w:abstractNum w:abstractNumId="4" w15:restartNumberingAfterBreak="0">
-    <w:multiLevelType w:val="hybridMultilevel"/>
-    <w:lvl w:ilvl="0" w15:tentative="1">
-      <w:start w:val="1"/>
-      <w:numFmt w:val="decimal"/>
-      <w:lvlText w:val="%1."/>
-      <w:lvlJc w:val="left"/>
-      <w:pPr>
-        <w:ind w:left="400" w:hanging="240"/>
-      </w:pPr>
-    </w:lvl>
-  </w:abstractNum>
-  <w:abstractNum w:abstractNumId="5" w15:restartNumberingAfterBreak="0">
     <w:multiLevelType w:val="hybridMultilevel"/>
     <w:lvl w:ilvl="0" w15:tentative="1">
       <w:start w:val="1"/>

</xml_diff>